<commit_message>
docs: update unit 4 activity with CI and Render deployment
- reflect GitHub Actions, 50 tests and 2 merged pull requests
- document automatic Render deployment and CI-gated auto-deploys
- add the generated PDF version of the activity
</commit_message>
<xml_diff>
--- a/docs/tps/tp_unidad_4_metodologia_parte2.docx
+++ b/docs/tps/tp_unidad_4_metodologia_parte2.docx
@@ -670,48 +670,48 @@
               <w:rPr>
                 <w:rtl w:val="0"/>
               </w:rPr>
-            </w:r>
-          </w:p>
-        </w:tc>
-        <w:tc>
-          <w:tcPr/>
-          <w:p>
-            <w:pPr>
-              <w:rPr>
-                <w:rFonts w:ascii="Calibri" w:cs="Calibri" w:eastAsia="Calibri" w:hAnsi="Calibri"/>
-                <w:sz w:val="20"/>
-                <w:szCs w:val="20"/>
-              </w:rPr>
-            </w:pPr>
-            <w:r>
-              <w:rPr>
-                <w:rFonts w:ascii="Calibri" w:cs="Calibri" w:eastAsia="Calibri" w:hAnsi="Calibri"/>
-                <w:sz w:val="20"/>
-                <w:szCs w:val="20"/>
-                <w:rtl w:val="0"/>
-              </w:rPr>
-              <w:t xml:space="preserve">Desarrollador → commit → push directo a main. No existe build ni test automático que valide el cambio.</w:t>
-            </w:r>
-          </w:p>
-        </w:tc>
-        <w:tc>
-          <w:tcPr/>
-          <w:p>
-            <w:pPr>
-              <w:rPr>
-                <w:rFonts w:ascii="Calibri" w:cs="Calibri" w:eastAsia="Calibri" w:hAnsi="Calibri"/>
-                <w:sz w:val="20"/>
-                <w:szCs w:val="20"/>
-              </w:rPr>
-            </w:pPr>
-            <w:r>
-              <w:rPr>
-                <w:rFonts w:ascii="Calibri" w:cs="Calibri" w:eastAsia="Calibri" w:hAnsi="Calibri"/>
-                <w:sz w:val="20"/>
-                <w:szCs w:val="20"/>
-                <w:rtl w:val="0"/>
-              </w:rPr>
-              <w:t xml:space="preserve">X</w:t>
+              <w:t>GitHub Actions (.github/workflows/ci.yml): en cada push y Pull Request a main se ejecutan checkout, Node 20, npm install, typecheck, los 50 tests (Vitest + pg-mem + supertest) y build de API y web. Cada ejecución queda registrada en la pestaña Actions.</w:t>
+            </w:r>
+          </w:p>
+        </w:tc>
+        <w:tc>
+          <w:tcPr/>
+          <w:p>
+            <w:pPr>
+              <w:rPr>
+                <w:rFonts w:ascii="Calibri" w:cs="Calibri" w:eastAsia="Calibri" w:hAnsi="Calibri"/>
+                <w:sz w:val="20"/>
+                <w:szCs w:val="20"/>
+              </w:rPr>
+            </w:pPr>
+            <w:r>
+              <w:rPr>
+                <w:rFonts w:ascii="Calibri" w:cs="Calibri" w:eastAsia="Calibri" w:hAnsi="Calibri"/>
+                <w:sz w:val="20"/>
+                <w:szCs w:val="20"/>
+                <w:rtl w:val="0"/>
+              </w:rPr>
+              <w:t>—</w:t>
+            </w:r>
+          </w:p>
+        </w:tc>
+        <w:tc>
+          <w:tcPr/>
+          <w:p>
+            <w:pPr>
+              <w:rPr>
+                <w:rFonts w:ascii="Calibri" w:cs="Calibri" w:eastAsia="Calibri" w:hAnsi="Calibri"/>
+                <w:sz w:val="20"/>
+                <w:szCs w:val="20"/>
+              </w:rPr>
+            </w:pPr>
+            <w:r>
+              <w:rPr>
+                <w:rFonts w:ascii="Calibri" w:cs="Calibri" w:eastAsia="Calibri" w:hAnsi="Calibri"/>
+                <w:sz w:val="20"/>
+                <w:szCs w:val="20"/>
+                <w:rtl w:val="0"/>
+              </w:rPr>
             </w:r>
           </w:p>
         </w:tc>
@@ -756,48 +756,48 @@
               <w:rPr>
                 <w:rtl w:val="0"/>
               </w:rPr>
-            </w:r>
-          </w:p>
-        </w:tc>
-        <w:tc>
-          <w:tcPr/>
-          <w:p>
-            <w:pPr>
-              <w:rPr>
-                <w:rFonts w:ascii="Calibri" w:cs="Calibri" w:eastAsia="Calibri" w:hAnsi="Calibri"/>
-                <w:sz w:val="20"/>
-                <w:szCs w:val="20"/>
-              </w:rPr>
-            </w:pPr>
-            <w:r>
-              <w:rPr>
-                <w:rFonts w:ascii="Calibri" w:cs="Calibri" w:eastAsia="Calibri" w:hAnsi="Calibri"/>
-                <w:sz w:val="20"/>
-                <w:szCs w:val="20"/>
-                <w:rtl w:val="0"/>
-              </w:rPr>
-              <w:t xml:space="preserve">El despliegue es manual: una persona ejecuta scripts/start.sh (Podman) en su propia máquina. No hay despliegue automático a ningún entorno.</w:t>
-            </w:r>
-          </w:p>
-        </w:tc>
-        <w:tc>
-          <w:tcPr/>
-          <w:p>
-            <w:pPr>
-              <w:rPr>
-                <w:rFonts w:ascii="Calibri" w:cs="Calibri" w:eastAsia="Calibri" w:hAnsi="Calibri"/>
-                <w:sz w:val="20"/>
-                <w:szCs w:val="20"/>
-              </w:rPr>
-            </w:pPr>
-            <w:r>
-              <w:rPr>
-                <w:rFonts w:ascii="Calibri" w:cs="Calibri" w:eastAsia="Calibri" w:hAnsi="Calibri"/>
-                <w:sz w:val="20"/>
-                <w:szCs w:val="20"/>
-                <w:rtl w:val="0"/>
-              </w:rPr>
-              <w:t xml:space="preserve">X</w:t>
+              <w:t>Render toma el último commit de main y despliega automáticamente la API y el frontend estático definidos en render.yaml; PostgreSQL se provisiona como base gestionada y scripts/init-db.mjs inicializa el esquema en el primer arranque. Con autoDeployTrigger: checksPass, el deploy espera a que CI termine correctamente.</w:t>
+            </w:r>
+          </w:p>
+        </w:tc>
+        <w:tc>
+          <w:tcPr/>
+          <w:p>
+            <w:pPr>
+              <w:rPr>
+                <w:rFonts w:ascii="Calibri" w:cs="Calibri" w:eastAsia="Calibri" w:hAnsi="Calibri"/>
+                <w:sz w:val="20"/>
+                <w:szCs w:val="20"/>
+              </w:rPr>
+            </w:pPr>
+            <w:r>
+              <w:rPr>
+                <w:rFonts w:ascii="Calibri" w:cs="Calibri" w:eastAsia="Calibri" w:hAnsi="Calibri"/>
+                <w:sz w:val="20"/>
+                <w:szCs w:val="20"/>
+                <w:rtl w:val="0"/>
+              </w:rPr>
+              <w:t>—</w:t>
+            </w:r>
+          </w:p>
+        </w:tc>
+        <w:tc>
+          <w:tcPr/>
+          <w:p>
+            <w:pPr>
+              <w:rPr>
+                <w:rFonts w:ascii="Calibri" w:cs="Calibri" w:eastAsia="Calibri" w:hAnsi="Calibri"/>
+                <w:sz w:val="20"/>
+                <w:szCs w:val="20"/>
+              </w:rPr>
+            </w:pPr>
+            <w:r>
+              <w:rPr>
+                <w:rFonts w:ascii="Calibri" w:cs="Calibri" w:eastAsia="Calibri" w:hAnsi="Calibri"/>
+                <w:sz w:val="20"/>
+                <w:szCs w:val="20"/>
+                <w:rtl w:val="0"/>
+              </w:rPr>
             </w:r>
           </w:p>
         </w:tc>
@@ -845,28 +845,28 @@
                 <w:szCs w:val="20"/>
                 <w:rtl w:val="0"/>
               </w:rPr>
-              <w:t xml:space="preserve">tsc (API), tsc + Vite build (frontend), Dockerfile para empaquetar ambos servicios.</w:t>
-            </w:r>
-          </w:p>
-        </w:tc>
-        <w:tc>
-          <w:tcPr/>
-          <w:p>
-            <w:pPr>
-              <w:rPr>
-                <w:rFonts w:ascii="Calibri" w:cs="Calibri" w:eastAsia="Calibri" w:hAnsi="Calibri"/>
-                <w:sz w:val="20"/>
-                <w:szCs w:val="20"/>
-              </w:rPr>
-            </w:pPr>
-            <w:r>
-              <w:rPr>
-                <w:rFonts w:ascii="Calibri" w:cs="Calibri" w:eastAsia="Calibri" w:hAnsi="Calibri"/>
-                <w:sz w:val="20"/>
-                <w:szCs w:val="20"/>
-                <w:rtl w:val="0"/>
-              </w:rPr>
-              <w:t xml:space="preserve">Código fuente → npm run build → tsc -p tsconfig.json (api) / tsc + vite build (web) → carpetas dist/. Se ejecuta manualmente, no está automatizado.</w:t>
+              <w:t>Automatizado en CI: tsc para la API, tsc + Vite para la web y typecheck del paquete móvil. Los Dockerfiles empaquetan API y web; el pipeline publica apps/api/dist y apps/web/dist. Render ejecuta npm install + build en su entorno para API y web.</w:t>
+            </w:r>
+          </w:p>
+        </w:tc>
+        <w:tc>
+          <w:tcPr/>
+          <w:p>
+            <w:pPr>
+              <w:rPr>
+                <w:rFonts w:ascii="Calibri" w:cs="Calibri" w:eastAsia="Calibri" w:hAnsi="Calibri"/>
+                <w:sz w:val="20"/>
+                <w:szCs w:val="20"/>
+              </w:rPr>
+            </w:pPr>
+            <w:r>
+              <w:rPr>
+                <w:rFonts w:ascii="Calibri" w:cs="Calibri" w:eastAsia="Calibri" w:hAnsi="Calibri"/>
+                <w:sz w:val="20"/>
+                <w:szCs w:val="20"/>
+                <w:rtl w:val="0"/>
+              </w:rPr>
+              <w:t>—</w:t>
             </w:r>
           </w:p>
         </w:tc>
@@ -928,48 +928,48 @@
               <w:rPr>
                 <w:rtl w:val="0"/>
               </w:rPr>
-            </w:r>
-          </w:p>
-        </w:tc>
-        <w:tc>
-          <w:tcPr/>
-          <w:p>
-            <w:pPr>
-              <w:rPr>
-                <w:rFonts w:ascii="Calibri" w:cs="Calibri" w:eastAsia="Calibri" w:hAnsi="Calibri"/>
-                <w:sz w:val="20"/>
-                <w:szCs w:val="20"/>
-              </w:rPr>
-            </w:pPr>
-            <w:r>
-              <w:rPr>
-                <w:rFonts w:ascii="Calibri" w:cs="Calibri" w:eastAsia="Calibri" w:hAnsi="Calibri"/>
-                <w:sz w:val="20"/>
-                <w:szCs w:val="20"/>
-                <w:rtl w:val="0"/>
-              </w:rPr>
-              <w:t xml:space="preserve">No existe un pipeline formal que encadene build → test → deploy. Las etapas se ejecutan a mano y por separado (npm test, npm run build, scripts/start.sh).</w:t>
-            </w:r>
-          </w:p>
-        </w:tc>
-        <w:tc>
-          <w:tcPr/>
-          <w:p>
-            <w:pPr>
-              <w:rPr>
-                <w:rFonts w:ascii="Calibri" w:cs="Calibri" w:eastAsia="Calibri" w:hAnsi="Calibri"/>
-                <w:sz w:val="20"/>
-                <w:szCs w:val="20"/>
-              </w:rPr>
-            </w:pPr>
-            <w:r>
-              <w:rPr>
-                <w:rFonts w:ascii="Calibri" w:cs="Calibri" w:eastAsia="Calibri" w:hAnsi="Calibri"/>
-                <w:sz w:val="20"/>
-                <w:szCs w:val="20"/>
-                <w:rtl w:val="0"/>
-              </w:rPr>
-              <w:t xml:space="preserve">X</w:t>
+              <w:t>Pipeline build-and-test en GitHub Actions con etapas encadenadas: checkout → setup Node → install → typecheck → tests → build → upload-artifact. Se dispara por push o PR contra main.</w:t>
+            </w:r>
+          </w:p>
+        </w:tc>
+        <w:tc>
+          <w:tcPr/>
+          <w:p>
+            <w:pPr>
+              <w:rPr>
+                <w:rFonts w:ascii="Calibri" w:cs="Calibri" w:eastAsia="Calibri" w:hAnsi="Calibri"/>
+                <w:sz w:val="20"/>
+                <w:szCs w:val="20"/>
+              </w:rPr>
+            </w:pPr>
+            <w:r>
+              <w:rPr>
+                <w:rFonts w:ascii="Calibri" w:cs="Calibri" w:eastAsia="Calibri" w:hAnsi="Calibri"/>
+                <w:sz w:val="20"/>
+                <w:szCs w:val="20"/>
+                <w:rtl w:val="0"/>
+              </w:rPr>
+              <w:t>—</w:t>
+            </w:r>
+          </w:p>
+        </w:tc>
+        <w:tc>
+          <w:tcPr/>
+          <w:p>
+            <w:pPr>
+              <w:rPr>
+                <w:rFonts w:ascii="Calibri" w:cs="Calibri" w:eastAsia="Calibri" w:hAnsi="Calibri"/>
+                <w:sz w:val="20"/>
+                <w:szCs w:val="20"/>
+              </w:rPr>
+            </w:pPr>
+            <w:r>
+              <w:rPr>
+                <w:rFonts w:ascii="Calibri" w:cs="Calibri" w:eastAsia="Calibri" w:hAnsi="Calibri"/>
+                <w:sz w:val="20"/>
+                <w:szCs w:val="20"/>
+                <w:rtl w:val="0"/>
+              </w:rPr>
             </w:r>
           </w:p>
         </w:tc>
@@ -1017,28 +1017,28 @@
                 <w:szCs w:val="20"/>
                 <w:rtl w:val="0"/>
               </w:rPr>
-              <w:t xml:space="preserve">apps/api/.env.example; variables definidas en docker-compose.yml (DATABASE_URL, JWT_SECRET, CORS_ORIGIN, PORT) y leídas en config.ts.</w:t>
-            </w:r>
-          </w:p>
-        </w:tc>
-        <w:tc>
-          <w:tcPr/>
-          <w:p>
-            <w:pPr>
-              <w:rPr>
-                <w:rFonts w:ascii="Calibri" w:cs="Calibri" w:eastAsia="Calibri" w:hAnsi="Calibri"/>
-                <w:sz w:val="20"/>
-                <w:szCs w:val="20"/>
-              </w:rPr>
-            </w:pPr>
-            <w:r>
-              <w:rPr>
-                <w:rFonts w:ascii="Calibri" w:cs="Calibri" w:eastAsia="Calibri" w:hAnsi="Calibri"/>
-                <w:sz w:val="20"/>
-                <w:szCs w:val="20"/>
-                <w:rtl w:val="0"/>
-              </w:rPr>
-              <w:t xml:space="preserve">docker-compose.yml inyecta JWT_SECRET, DATABASE_URL y CORS_ORIGIN como variables de entorno del contenedor de la API; config.ts las lee en tiempo de ejecución.</w:t>
+              <w:t>apps/api/.env.example y config.ts centralizan DATABASE_URL, JWT_SECRET, PORT, CORS_ORIGIN, APP_URL, UPLOADS_DIR, SMTP_* y BANK_*. Podman/Compose las inyectan; Render define DATABASE_URL, JWT_SECRET, CORS_ORIGIN, APP_URL y VITE_API_URL; la app móvil usa EXPO_PUBLIC_API_URL. Los secretos no se versionan.</w:t>
+            </w:r>
+          </w:p>
+        </w:tc>
+        <w:tc>
+          <w:tcPr/>
+          <w:p>
+            <w:pPr>
+              <w:rPr>
+                <w:rFonts w:ascii="Calibri" w:cs="Calibri" w:eastAsia="Calibri" w:hAnsi="Calibri"/>
+                <w:sz w:val="20"/>
+                <w:szCs w:val="20"/>
+              </w:rPr>
+            </w:pPr>
+            <w:r>
+              <w:rPr>
+                <w:rFonts w:ascii="Calibri" w:cs="Calibri" w:eastAsia="Calibri" w:hAnsi="Calibri"/>
+                <w:sz w:val="20"/>
+                <w:szCs w:val="20"/>
+                <w:rtl w:val="0"/>
+              </w:rPr>
+              <w:t>—</w:t>
             </w:r>
           </w:p>
         </w:tc>
@@ -1100,48 +1100,48 @@
               <w:rPr>
                 <w:rtl w:val="0"/>
               </w:rPr>
-            </w:r>
-          </w:p>
-        </w:tc>
-        <w:tc>
-          <w:tcPr/>
-          <w:p>
-            <w:pPr>
-              <w:rPr>
-                <w:rFonts w:ascii="Calibri" w:cs="Calibri" w:eastAsia="Calibri" w:hAnsi="Calibri"/>
-                <w:sz w:val="20"/>
-                <w:szCs w:val="20"/>
-              </w:rPr>
-            </w:pPr>
-            <w:r>
-              <w:rPr>
-                <w:rFonts w:ascii="Calibri" w:cs="Calibri" w:eastAsia="Calibri" w:hAnsi="Calibri"/>
-                <w:sz w:val="20"/>
-                <w:szCs w:val="20"/>
-                <w:rtl w:val="0"/>
-              </w:rPr>
-              <w:t xml:space="preserve">Cada build genera dist/ localmente y se descarta; las imágenes Docker se construyen en la máquina de quien despliega y no se publican ni versionan en un registry.</w:t>
-            </w:r>
-          </w:p>
-        </w:tc>
-        <w:tc>
-          <w:tcPr/>
-          <w:p>
-            <w:pPr>
-              <w:rPr>
-                <w:rFonts w:ascii="Calibri" w:cs="Calibri" w:eastAsia="Calibri" w:hAnsi="Calibri"/>
-                <w:sz w:val="20"/>
-                <w:szCs w:val="20"/>
-              </w:rPr>
-            </w:pPr>
-            <w:r>
-              <w:rPr>
-                <w:rFonts w:ascii="Calibri" w:cs="Calibri" w:eastAsia="Calibri" w:hAnsi="Calibri"/>
-                <w:sz w:val="20"/>
-                <w:szCs w:val="20"/>
-                <w:rtl w:val="0"/>
-              </w:rPr>
-              <w:t xml:space="preserve">X</w:t>
+              <w:t>GitHub Actions publica apps/api/dist y apps/web/dist con actions/upload-artifact (retención 7 días). Las imágenes Docker se construyen localmente; publicarlas en un registry queda pendiente. Render reconstruye desde el código fuente; los artefactos de CI quedan para trazabilidad y reutilización.</w:t>
+            </w:r>
+          </w:p>
+        </w:tc>
+        <w:tc>
+          <w:tcPr/>
+          <w:p>
+            <w:pPr>
+              <w:rPr>
+                <w:rFonts w:ascii="Calibri" w:cs="Calibri" w:eastAsia="Calibri" w:hAnsi="Calibri"/>
+                <w:sz w:val="20"/>
+                <w:szCs w:val="20"/>
+              </w:rPr>
+            </w:pPr>
+            <w:r>
+              <w:rPr>
+                <w:rFonts w:ascii="Calibri" w:cs="Calibri" w:eastAsia="Calibri" w:hAnsi="Calibri"/>
+                <w:sz w:val="20"/>
+                <w:szCs w:val="20"/>
+                <w:rtl w:val="0"/>
+              </w:rPr>
+              <w:t>—</w:t>
+            </w:r>
+          </w:p>
+        </w:tc>
+        <w:tc>
+          <w:tcPr/>
+          <w:p>
+            <w:pPr>
+              <w:rPr>
+                <w:rFonts w:ascii="Calibri" w:cs="Calibri" w:eastAsia="Calibri" w:hAnsi="Calibri"/>
+                <w:sz w:val="20"/>
+                <w:szCs w:val="20"/>
+              </w:rPr>
+            </w:pPr>
+            <w:r>
+              <w:rPr>
+                <w:rFonts w:ascii="Calibri" w:cs="Calibri" w:eastAsia="Calibri" w:hAnsi="Calibri"/>
+                <w:sz w:val="20"/>
+                <w:szCs w:val="20"/>
+                <w:rtl w:val="0"/>
+              </w:rPr>
             </w:r>
           </w:p>
         </w:tc>
@@ -1186,48 +1186,48 @@
               <w:rPr>
                 <w:rtl w:val="0"/>
               </w:rPr>
-            </w:r>
-          </w:p>
-        </w:tc>
-        <w:tc>
-          <w:tcPr/>
-          <w:p>
-            <w:pPr>
-              <w:rPr>
-                <w:rFonts w:ascii="Calibri" w:cs="Calibri" w:eastAsia="Calibri" w:hAnsi="Calibri"/>
-                <w:sz w:val="20"/>
-                <w:szCs w:val="20"/>
-              </w:rPr>
-            </w:pPr>
-            <w:r>
-              <w:rPr>
-                <w:rFonts w:ascii="Calibri" w:cs="Calibri" w:eastAsia="Calibri" w:hAnsi="Calibri"/>
-                <w:sz w:val="20"/>
-                <w:szCs w:val="20"/>
-                <w:rtl w:val="0"/>
-              </w:rPr>
-              <w:t xml:space="preserve">El repositorio en GitHub no está conectado a GitHub Actions, GitLab CI ni Jenkins; no hay workflows configurados (0 workflows).</w:t>
-            </w:r>
-          </w:p>
-        </w:tc>
-        <w:tc>
-          <w:tcPr/>
-          <w:p>
-            <w:pPr>
-              <w:rPr>
-                <w:rFonts w:ascii="Calibri" w:cs="Calibri" w:eastAsia="Calibri" w:hAnsi="Calibri"/>
-                <w:sz w:val="20"/>
-                <w:szCs w:val="20"/>
-              </w:rPr>
-            </w:pPr>
-            <w:r>
-              <w:rPr>
-                <w:rFonts w:ascii="Calibri" w:cs="Calibri" w:eastAsia="Calibri" w:hAnsi="Calibri"/>
-                <w:sz w:val="20"/>
-                <w:szCs w:val="20"/>
-                <w:rtl w:val="0"/>
-              </w:rPr>
-              <w:t xml:space="preserve">X</w:t>
+              <w:t>GitHub Actions está conectado al repositorio: cada push/PR a main genera una corrida con resultado y artefactos. Trazabilidad commit → workflow run → resultado → artefacto.</w:t>
+            </w:r>
+          </w:p>
+        </w:tc>
+        <w:tc>
+          <w:tcPr/>
+          <w:p>
+            <w:pPr>
+              <w:rPr>
+                <w:rFonts w:ascii="Calibri" w:cs="Calibri" w:eastAsia="Calibri" w:hAnsi="Calibri"/>
+                <w:sz w:val="20"/>
+                <w:szCs w:val="20"/>
+              </w:rPr>
+            </w:pPr>
+            <w:r>
+              <w:rPr>
+                <w:rFonts w:ascii="Calibri" w:cs="Calibri" w:eastAsia="Calibri" w:hAnsi="Calibri"/>
+                <w:sz w:val="20"/>
+                <w:szCs w:val="20"/>
+                <w:rtl w:val="0"/>
+              </w:rPr>
+              <w:t>—</w:t>
+            </w:r>
+          </w:p>
+        </w:tc>
+        <w:tc>
+          <w:tcPr/>
+          <w:p>
+            <w:pPr>
+              <w:rPr>
+                <w:rFonts w:ascii="Calibri" w:cs="Calibri" w:eastAsia="Calibri" w:hAnsi="Calibri"/>
+                <w:sz w:val="20"/>
+                <w:szCs w:val="20"/>
+              </w:rPr>
+            </w:pPr>
+            <w:r>
+              <w:rPr>
+                <w:rFonts w:ascii="Calibri" w:cs="Calibri" w:eastAsia="Calibri" w:hAnsi="Calibri"/>
+                <w:sz w:val="20"/>
+                <w:szCs w:val="20"/>
+                <w:rtl w:val="0"/>
+              </w:rPr>
             </w:r>
           </w:p>
         </w:tc>
@@ -1272,48 +1272,48 @@
               <w:rPr>
                 <w:rtl w:val="0"/>
               </w:rPr>
-            </w:r>
-          </w:p>
-        </w:tc>
-        <w:tc>
-          <w:tcPr/>
-          <w:p>
-            <w:pPr>
-              <w:rPr>
-                <w:rFonts w:ascii="Calibri" w:cs="Calibri" w:eastAsia="Calibri" w:hAnsi="Calibri"/>
-                <w:sz w:val="20"/>
-                <w:szCs w:val="20"/>
-              </w:rPr>
-            </w:pPr>
-            <w:r>
-              <w:rPr>
-                <w:rFonts w:ascii="Calibri" w:cs="Calibri" w:eastAsia="Calibri" w:hAnsi="Calibri"/>
-                <w:sz w:val="20"/>
-                <w:szCs w:val="20"/>
-                <w:rtl w:val="0"/>
-              </w:rPr>
-              <w:t xml:space="preserve">Historial real: 10/10 commits sobre main fueron pusheados directo por sus autores, sin un solo Pull Request (verificado con la API: 0 PRs).</w:t>
-            </w:r>
-          </w:p>
-        </w:tc>
-        <w:tc>
-          <w:tcPr/>
-          <w:p>
-            <w:pPr>
-              <w:rPr>
-                <w:rFonts w:ascii="Calibri" w:cs="Calibri" w:eastAsia="Calibri" w:hAnsi="Calibri"/>
-                <w:sz w:val="20"/>
-                <w:szCs w:val="20"/>
-              </w:rPr>
-            </w:pPr>
-            <w:r>
-              <w:rPr>
-                <w:rFonts w:ascii="Calibri" w:cs="Calibri" w:eastAsia="Calibri" w:hAnsi="Calibri"/>
-                <w:sz w:val="20"/>
-                <w:szCs w:val="20"/>
-                <w:rtl w:val="0"/>
-              </w:rPr>
-              <w:t xml:space="preserve">X</w:t>
+              <w:t>Existe .github/pull_request_template.md y se mergearon 2 Pull Requests (#1 y #2) desde rama_nueva. Falta activar branch protection con el check build-and-test como obligatorio. Cada merge a main dispara el auto-deploy de Render.</w:t>
+            </w:r>
+          </w:p>
+        </w:tc>
+        <w:tc>
+          <w:tcPr/>
+          <w:p>
+            <w:pPr>
+              <w:rPr>
+                <w:rFonts w:ascii="Calibri" w:cs="Calibri" w:eastAsia="Calibri" w:hAnsi="Calibri"/>
+                <w:sz w:val="20"/>
+                <w:szCs w:val="20"/>
+              </w:rPr>
+            </w:pPr>
+            <w:r>
+              <w:rPr>
+                <w:rFonts w:ascii="Calibri" w:cs="Calibri" w:eastAsia="Calibri" w:hAnsi="Calibri"/>
+                <w:sz w:val="20"/>
+                <w:szCs w:val="20"/>
+                <w:rtl w:val="0"/>
+              </w:rPr>
+              <w:t>—</w:t>
+            </w:r>
+          </w:p>
+        </w:tc>
+        <w:tc>
+          <w:tcPr/>
+          <w:p>
+            <w:pPr>
+              <w:rPr>
+                <w:rFonts w:ascii="Calibri" w:cs="Calibri" w:eastAsia="Calibri" w:hAnsi="Calibri"/>
+                <w:sz w:val="20"/>
+                <w:szCs w:val="20"/>
+              </w:rPr>
+            </w:pPr>
+            <w:r>
+              <w:rPr>
+                <w:rFonts w:ascii="Calibri" w:cs="Calibri" w:eastAsia="Calibri" w:hAnsi="Calibri"/>
+                <w:sz w:val="20"/>
+                <w:szCs w:val="20"/>
+                <w:rtl w:val="0"/>
+              </w:rPr>
             </w:r>
           </w:p>
         </w:tc>
@@ -1378,28 +1378,28 @@
                 <w:szCs w:val="20"/>
                 <w:rtl w:val="0"/>
               </w:rPr>
-              <w:t xml:space="preserve">GitHub Issues está habilitado en el repositorio pero no se registró ningún issue (0 issues).</w:t>
-            </w:r>
-          </w:p>
-        </w:tc>
-        <w:tc>
-          <w:tcPr/>
-          <w:p>
-            <w:pPr>
-              <w:rPr>
-                <w:rFonts w:ascii="Calibri" w:cs="Calibri" w:eastAsia="Calibri" w:hAnsi="Calibri"/>
-                <w:sz w:val="20"/>
-                <w:szCs w:val="20"/>
-              </w:rPr>
-            </w:pPr>
-            <w:r>
-              <w:rPr>
-                <w:rFonts w:ascii="Calibri" w:cs="Calibri" w:eastAsia="Calibri" w:hAnsi="Calibri"/>
-                <w:sz w:val="20"/>
-                <w:szCs w:val="20"/>
-                <w:rtl w:val="0"/>
-              </w:rPr>
-              <w:t xml:space="preserve">X</w:t>
+              <w:t>No se usaron issues: el seguimiento se hizo con commits, Pull Requests y documentación en docs/.</w:t>
+            </w:r>
+          </w:p>
+        </w:tc>
+        <w:tc>
+          <w:tcPr/>
+          <w:p>
+            <w:pPr>
+              <w:rPr>
+                <w:rFonts w:ascii="Calibri" w:cs="Calibri" w:eastAsia="Calibri" w:hAnsi="Calibri"/>
+                <w:sz w:val="20"/>
+                <w:szCs w:val="20"/>
+              </w:rPr>
+            </w:pPr>
+            <w:r>
+              <w:rPr>
+                <w:rFonts w:ascii="Calibri" w:cs="Calibri" w:eastAsia="Calibri" w:hAnsi="Calibri"/>
+                <w:sz w:val="20"/>
+                <w:szCs w:val="20"/>
+                <w:rtl w:val="0"/>
+              </w:rPr>
+              <w:t>X</w:t>
             </w:r>
           </w:p>
         </w:tc>
@@ -1464,28 +1464,28 @@
                 <w:szCs w:val="20"/>
                 <w:rtl w:val="0"/>
               </w:rPr>
-              <w:t xml:space="preserve">La Wiki está habilitada pero vacía; la documentación del proyecto vive como archivos sueltos en docs/.</w:t>
-            </w:r>
-          </w:p>
-        </w:tc>
-        <w:tc>
-          <w:tcPr/>
-          <w:p>
-            <w:pPr>
-              <w:rPr>
-                <w:rFonts w:ascii="Calibri" w:cs="Calibri" w:eastAsia="Calibri" w:hAnsi="Calibri"/>
-                <w:sz w:val="20"/>
-                <w:szCs w:val="20"/>
-              </w:rPr>
-            </w:pPr>
-            <w:r>
-              <w:rPr>
-                <w:rFonts w:ascii="Calibri" w:cs="Calibri" w:eastAsia="Calibri" w:hAnsi="Calibri"/>
-                <w:sz w:val="20"/>
-                <w:szCs w:val="20"/>
-                <w:rtl w:val="0"/>
-              </w:rPr>
-              <w:t xml:space="preserve">X</w:t>
+              <w:t>La Wiki de GitHub está habilitada pero vacía; la documentación vive como archivos Markdown/PDF en docs/.</w:t>
+            </w:r>
+          </w:p>
+        </w:tc>
+        <w:tc>
+          <w:tcPr/>
+          <w:p>
+            <w:pPr>
+              <w:rPr>
+                <w:rFonts w:ascii="Calibri" w:cs="Calibri" w:eastAsia="Calibri" w:hAnsi="Calibri"/>
+                <w:sz w:val="20"/>
+                <w:szCs w:val="20"/>
+              </w:rPr>
+            </w:pPr>
+            <w:r>
+              <w:rPr>
+                <w:rFonts w:ascii="Calibri" w:cs="Calibri" w:eastAsia="Calibri" w:hAnsi="Calibri"/>
+                <w:sz w:val="20"/>
+                <w:szCs w:val="20"/>
+                <w:rtl w:val="0"/>
+              </w:rPr>
+              <w:t>X</w:t>
             </w:r>
           </w:p>
         </w:tc>
@@ -1550,28 +1550,28 @@
                 <w:szCs w:val="20"/>
                 <w:rtl w:val="0"/>
               </w:rPr>
-              <w:t xml:space="preserve">GitHub Projects está habilitado pero no hay ningún tablero creado; no hay visualización de To Do / In Progress / Done.</w:t>
-            </w:r>
-          </w:p>
-        </w:tc>
-        <w:tc>
-          <w:tcPr/>
-          <w:p>
-            <w:pPr>
-              <w:rPr>
-                <w:rFonts w:ascii="Calibri" w:cs="Calibri" w:eastAsia="Calibri" w:hAnsi="Calibri"/>
-                <w:sz w:val="20"/>
-                <w:szCs w:val="20"/>
-              </w:rPr>
-            </w:pPr>
-            <w:r>
-              <w:rPr>
-                <w:rFonts w:ascii="Calibri" w:cs="Calibri" w:eastAsia="Calibri" w:hAnsi="Calibri"/>
-                <w:sz w:val="20"/>
-                <w:szCs w:val="20"/>
-                <w:rtl w:val="0"/>
-              </w:rPr>
-              <w:t xml:space="preserve">X</w:t>
+              <w:t>No hay tablero en GitHub Projects; la planificación está en docs/planificacionDeSprints.md y docs/planDeTrabajo*.md, sin visualización To Do / In Progress / Done.</w:t>
+            </w:r>
+          </w:p>
+        </w:tc>
+        <w:tc>
+          <w:tcPr/>
+          <w:p>
+            <w:pPr>
+              <w:rPr>
+                <w:rFonts w:ascii="Calibri" w:cs="Calibri" w:eastAsia="Calibri" w:hAnsi="Calibri"/>
+                <w:sz w:val="20"/>
+                <w:szCs w:val="20"/>
+              </w:rPr>
+            </w:pPr>
+            <w:r>
+              <w:rPr>
+                <w:rFonts w:ascii="Calibri" w:cs="Calibri" w:eastAsia="Calibri" w:hAnsi="Calibri"/>
+                <w:sz w:val="20"/>
+                <w:szCs w:val="20"/>
+                <w:rtl w:val="0"/>
+              </w:rPr>
+              <w:t>X</w:t>
             </w:r>
           </w:p>
         </w:tc>
@@ -1619,28 +1619,28 @@
                 <w:szCs w:val="20"/>
                 <w:rtl w:val="0"/>
               </w:rPr>
-              <w:t xml:space="preserve">Pruebas automatizadas (Vitest + pg-mem, 16 tests); patrones de diseño GoF (Singleton, Proxy, Iterator) documentados en el README con archivo y líneas exactas.</w:t>
-            </w:r>
-          </w:p>
-        </w:tc>
-        <w:tc>
-          <w:tcPr/>
-          <w:p>
-            <w:pPr>
-              <w:rPr>
-                <w:rFonts w:ascii="Calibri" w:cs="Calibri" w:eastAsia="Calibri" w:hAnsi="Calibri"/>
-                <w:sz w:val="20"/>
-                <w:szCs w:val="20"/>
-              </w:rPr>
-            </w:pPr>
-            <w:r>
-              <w:rPr>
-                <w:rFonts w:ascii="Calibri" w:cs="Calibri" w:eastAsia="Calibri" w:hAnsi="Calibri"/>
-                <w:sz w:val="20"/>
-                <w:szCs w:val="20"/>
-                <w:rtl w:val="0"/>
-              </w:rPr>
-              <w:t xml:space="preserve">npm test → Vitest levanta una base pg-mem en memoria y corre 16 tests de autenticación, RBAC, inscripciones, reportes, etc. Se ejecuta a demanda, no está integrado a ningún pipeline.</w:t>
+              <w:t>Pruebas automatizadas (Vitest + pg-mem + supertest, 50 tests); typecheck de API, web y móvil; patrones de diseño GoF (Singleton, Proxy, Iterator); app móvil Expo y módulo económico de cuotas, facturas, comprobantes y pagos. Despliegue automático en Render con blueprint (render.yaml).</w:t>
+            </w:r>
+          </w:p>
+        </w:tc>
+        <w:tc>
+          <w:tcPr/>
+          <w:p>
+            <w:pPr>
+              <w:rPr>
+                <w:rFonts w:ascii="Calibri" w:cs="Calibri" w:eastAsia="Calibri" w:hAnsi="Calibri"/>
+                <w:sz w:val="20"/>
+                <w:szCs w:val="20"/>
+              </w:rPr>
+            </w:pPr>
+            <w:r>
+              <w:rPr>
+                <w:rFonts w:ascii="Calibri" w:cs="Calibri" w:eastAsia="Calibri" w:hAnsi="Calibri"/>
+                <w:sz w:val="20"/>
+                <w:szCs w:val="20"/>
+                <w:rtl w:val="0"/>
+              </w:rPr>
+              <w:t>npm test → Vitest levanta una base pg-mem en memoria y corre 50 tests de autenticación, RBAC, inscripciones, transporte, comedor, reportes, facturación y comprobantes. Se ejecuta a demanda y también dentro del job build-and-test de GitHub Actions.</w:t>
             </w:r>
           </w:p>
         </w:tc>
@@ -1988,7 +1988,7 @@
           <w:szCs w:val="22"/>
           <w:rtl w:val="0"/>
         </w:rPr>
-        <w:t xml:space="preserve">- Pipeline de Integración Continua (.github/workflows/ci.yml): workflow de GitHub Actions que se dispara en cada push y cada Pull Request contra main. Ejecuta, en orden: checkout del código, configuración de Node 20, instalación de dependencias, typecheck, ejecución de la suite de tests (Vitest + pg-mem) y build (tsc + Vite). Al finalizar, publica como artefacto los directorios dist/ generados.</w:t>
+        <w:t>- Pipeline de Integración Continua (.github/workflows/ci.yml): workflow de GitHub Actions que se dispara en cada push y cada Pull Request contra main. Ejecuta, en orden: checkout del código, configuración de Node 20, instalación de dependencias, typecheck de API/web/móvil, ejecución de los 50 tests (Vitest + pg-mem + supertest) y build (tsc + Vite). Al finalizar, publica como artefacto los directorios apps/api/dist y apps/web/dist. Después del merge, Render toma el último commit de main y despliega API y web.</w:t>
       </w:r>
     </w:p>
     <w:p>
@@ -2008,7 +2008,7 @@
           <w:szCs w:val="22"/>
           <w:rtl w:val="0"/>
         </w:rPr>
-        <w:t xml:space="preserve">- Validación local antes de subir el pipeline: npm run typecheck sin errores; npm test con 16/16 tests pasados (autenticación, RBAC, inscripciones, transporte, comedor, reportes, HU-05, HU-07); npm run build genera apps/api/dist y apps/web/dist correctamente. Tiempo total del pipeline (typecheck + test + build): 22,7 segundos.</w:t>
+        <w:t>- Validación local antes de subir el pipeline: npm run typecheck sin errores; npm test con 50/50 tests pasados (autenticación, RBAC, inscripciones, transporte, comedor, reportes, HU-05, HU-07, facturación y comprobantes); npm run build genera apps/api/dist y apps/web/dist correctamente. Tiempo total del pipeline (typecheck + test + build): 33,1 segundos.</w:t>
       </w:r>
     </w:p>
     <w:p>
@@ -2028,7 +2028,7 @@
           <w:szCs w:val="22"/>
           <w:rtl w:val="0"/>
         </w:rPr>
-        <w:t xml:space="preserve">- Flujo de Pull Requests y Merge Requests (.github/pull_request_template.md): plantilla con descripción del cambio, tipo de cambio, checklist de calidad (CI en verde, tests agregados, sin secretos en el código, rama actualizada) y un apartado para describir cómo probarlo. El flujo de trabajo pasa a ser: Issue → rama feature/* → commits → Pull Request → CI (build-and-test) → Code Review → Merge a main.</w:t>
+        <w:t>- Flujo de Pull Requests y Merge Requests (.github/pull_request_template.md): plantilla con descripción del cambio, tipo de cambio, checklist de calidad (CI en verde, tests agregados, sin secretos en el código, rama actualizada) y un apartado para describir cómo probarlo. El flujo de trabajo pasa a ser: Issue → rama feature/* → commits → Pull Request → CI (build-and-test) → Code Review → Merge a main. Ya se mergearon 2 Pull Requests (#1 y #2) desde rama_nueva. Cada merge a main dispara el auto-deploy de Render.</w:t>
       </w:r>
     </w:p>
     <w:p>
@@ -2048,7 +2048,7 @@
           <w:szCs w:val="22"/>
           <w:rtl w:val="0"/>
         </w:rPr>
-        <w:t xml:space="preserve">- Para que este flujo sea obligatorio falta activar en GitHub: Settings → Branches → Branch protection rules → Require status checks to pass before merging, seleccionando el check build-and-test (requiere permisos de administrador del repositorio).</w:t>
+        <w:t>- Para que este flujo sea obligatorio falta activar en GitHub: Settings → Branches → Branch protection rules → Require status checks to pass before merging, seleccionando el check build-and-test (requiere permisos de administrador del repositorio). Además, render.yaml puede declarar autoDeployTrigger: checksPass para que Render espere a que CI termine antes de desplegar.</w:t>
       </w:r>
     </w:p>
     <w:p>
@@ -2344,7 +2344,7 @@
           <w:szCs w:val="22"/>
           <w:rtl w:val="0"/>
         </w:rPr>
-        <w:t xml:space="preserve">Se ejecutó git_metrics.py sobre el historial real de la rama main del repositorio (10 commits, del 23/08/2026 al 06/10/2026):</w:t>
+        <w:t>Se ejecutó git_metrics.py sobre el historial real de la rama main del repositorio (32 commits, del 23/08/2026 al 27/10/2026): Con el auto-deploy de Render, cada commit/merge a main genera un despliegue.</w:t>
       </w:r>
     </w:p>
     <w:p>
@@ -2364,7 +2364,7 @@
           <w:szCs w:val="22"/>
           <w:rtl w:val="0"/>
         </w:rPr>
-        <w:t xml:space="preserve">- Deployment Frequency (proxy): 1,58 commits/semana.</w:t>
+        <w:t>- Deployment Frequency (commits/merges a main; con auto-deploy de Render, cada uno genera un despliegue): 3,45 despliegues/semana.</w:t>
       </w:r>
     </w:p>
     <w:p>
@@ -2384,7 +2384,7 @@
           <w:szCs w:val="22"/>
           <w:rtl w:val="0"/>
         </w:rPr>
-        <w:t xml:space="preserve">- Lead Time promedio entre integraciones: 117,8 horas.</w:t>
+        <w:t>- Lead Time promedio entre integraciones: 50,3 horas.</w:t>
       </w:r>
     </w:p>
     <w:p>
@@ -2404,7 +2404,7 @@
           <w:szCs w:val="22"/>
           <w:rtl w:val="0"/>
         </w:rPr>
-        <w:t xml:space="preserve">- Lead Time mediana: 47,0 horas.</w:t>
+        <w:t>- Lead Time mediana: 0,2 horas.</w:t>
       </w:r>
     </w:p>
     <w:p>
@@ -2424,7 +2424,7 @@
           <w:szCs w:val="22"/>
           <w:rtl w:val="0"/>
         </w:rPr>
-        <w:t xml:space="preserve">- Lead Time máximo: 450,4 horas (≈18,8 días).</w:t>
+        <w:t>- Lead Time máximo: 450,4 horas (≈18,8 días).</w:t>
       </w:r>
     </w:p>
     <w:p>
@@ -2444,7 +2444,7 @@
           <w:szCs w:val="22"/>
           <w:rtl w:val="0"/>
         </w:rPr>
-        <w:t xml:space="preserve">- Lead Time mínimo: 0,0 horas.</w:t>
+        <w:t>- Lead Time mínimo: 0,0 horas.</w:t>
       </w:r>
     </w:p>
     <w:p>
@@ -2463,7 +2463,7 @@
           <w:szCs w:val="22"/>
           <w:rtl w:val="0"/>
         </w:rPr>
-        <w:t xml:space="preserve">Adicionalmente, al correr localmente el pipeline de CI implementado en el punto 3, se midió un tiempo de 22,7 segundos para validar un cambio completo (typecheck + 16 tests + build), frente a la validación manual actual, que no tiene un tiempo definido porque no es sistemática (0 corridas de CI sobre los 10 commits).</w:t>
+        <w:t>Adicionalmente, al correr localmente el pipeline de CI implementado en el punto 3, se midió un tiempo de 33,1 segundos para validar un cambio completo (typecheck + 50 tests + build), frente a la validación manual previa, que no tenía un tiempo definido y no dejaba registro sistemático (0 corridas de CI antes de incorporar el workflow).</w:t>
       </w:r>
     </w:p>
     <w:p>
@@ -2562,7 +2562,7 @@
           <w:szCs w:val="22"/>
           <w:rtl w:val="0"/>
         </w:rPr>
-        <w:t xml:space="preserve">La brecha entre la mediana (47 h) y el máximo (450 h) muestra alta variabilidad: hay largos períodos sin integrar código seguidos de cargas masivas de cambios, lo opuesto al principio de integrar frecuentemente en lotes pequeños. Además, el 100% de esas integraciones se hicieron sin ninguna validación automática, por lo que el riesgo de que un error llegue a main sin detectarse es alto. Estrategias definidas:</w:t>
+        <w:t>La mediana (0,2 h) y el máximo (450,4 h) muestran una distribución muy irregular: muchas integraciones se agruparon en pocas horas y hubo un período prolongado sin integraciones. Además, antes de incorporar la CI el 100% de esas integraciones se hicieron sin validación automática, por lo que el riesgo de que un error llegue a main sin detectarse era alto. Estrategias definidas:</w:t>
       </w:r>
     </w:p>
     <w:p>
@@ -2582,7 +2582,7 @@
           <w:szCs w:val="22"/>
           <w:rtl w:val="0"/>
         </w:rPr>
-        <w:t xml:space="preserve">- Automatizar la validación con CI, para que cada integración se compile y pruebe en segundos en lugar de depender de una revisión manual indeterminada.</w:t>
+        <w:t>- Automatizar la validación con CI (ya implementado): cada integración se compila y prueba en 33,1 s en GitHub Actions, en lugar de depender de una revisión manual indeterminada.</w:t>
       </w:r>
     </w:p>
     <w:p>
@@ -2602,7 +2602,7 @@
           <w:szCs w:val="22"/>
           <w:rtl w:val="0"/>
         </w:rPr>
-        <w:t xml:space="preserve">- Exigir Pull Requests con CI en verde como quality gate antes de mergear a main, en vez de permitir push directo.</w:t>
+        <w:t>- Exigir Pull Requests con CI en verde como quality gate antes de mergear a main (flujo adoptado; falta activar branch protection).</w:t>
       </w:r>
     </w:p>
     <w:p>
@@ -2622,7 +2622,7 @@
           <w:szCs w:val="22"/>
           <w:rtl w:val="0"/>
         </w:rPr>
-        <w:t xml:space="preserve">- Fomentar integraciones más chicas y frecuentes, para reducir el Lead Time y su variabilidad.</w:t>
+        <w:t>- Fomentar integraciones más chicas y frecuentes, para reducir el Lead Time y su variabilidad.</w:t>
       </w:r>
     </w:p>
     <w:p>
@@ -2642,7 +2642,27 @@
           <w:szCs w:val="22"/>
           <w:rtl w:val="0"/>
         </w:rPr>
-        <w:t xml:space="preserve">- A partir de la adopción, medir el Lead Time real como tiempo entre apertura y merge del Pull Request (más preciso que el proxy basado en commits), usando la API de Pull Requests de GitHub.</w:t>
+        <w:t>- Medir el Lead Time real como tiempo entre apertura y merge del Pull Request (más preciso que el proxy basado en commits), usando la API de Pull Requests de GitHub cuando el equipo esté autenticado.</w:t>
+      </w:r>
+    </w:p>
+    <w:p>
+      <w:pPr/>
+      <w:r>
+        <w:rPr>
+          <w:rFonts w:ascii="Calibri" w:hAnsi="Calibri"/>
+          <w:sz w:val="22"/>
+        </w:rPr>
+        <w:t>- Publicar las imágenes Docker en un registry para completar la gestión de artefactos y reutilizar la misma versión en cada despliegue.</w:t>
+      </w:r>
+    </w:p>
+    <w:p>
+      <w:pPr/>
+      <w:r>
+        <w:rPr>
+          <w:rFonts w:ascii="Calibri" w:hAnsi="Calibri"/>
+          <w:sz w:val="22"/>
+        </w:rPr>
+        <w:t>- Configurar Render con autoDeployTrigger: checksPass para que el despliegue del último commit espere a que CI termine, y automatizar las migraciones sobre bases existentes (hoy scripts/init-db.mjs solo inicializa el esquema la primera vez).</w:t>
       </w:r>
     </w:p>
     <w:p>
@@ -2741,7 +2761,7 @@
           <w:szCs w:val="22"/>
           <w:rtl w:val="0"/>
         </w:rPr>
-        <w:t xml:space="preserve">Las estrategias de CI y Pull Requests ya se implementaron y se validaron localmente en el punto 3. La columna “Después” refleja lo que ese pipeline mide y garantiza una vez subido al repositorio; el Lead Time y la Deployment Frequency reales post-adopción (medidos con la API de Pull Requests) deberán actualizarse una vez que el equipo use el flujo durante algunas semanas.</w:t>
+        <w:t>Las estrategias de CI y Pull Requests ya están implementadas y en uso: el workflow se ejecuta en GitHub Actions, se publican artefactos y se mergearon 2 Pull Requests. La columna “Después” refleja lo que el pipeline mide y garantiza; el Lead Time y la Deployment Frequency reales post-adopción (medidos con la API de Pull Requests) deberán actualizarse cuando el equipo use el flujo durante algunas semanas. También queda pendiente activar branch protection con el check build-and-test como obligatorio. Render despliega automáticamente el último commit de main; queda pendiente que las migraciones se apliquen en cada deploy sobre una base ya inicializada.</w:t>
       </w:r>
     </w:p>
     <w:tbl>
@@ -2882,7 +2902,7 @@
                 <w:szCs w:val="18"/>
                 <w:rtl w:val="0"/>
               </w:rPr>
-              <w:t xml:space="preserve">Deployment Frequency (proxy: commits/semana a main)</w:t>
+              <w:t>Deployment Frequency (commits/merges a main; auto-deploy de Render)</w:t>
             </w:r>
           </w:p>
         </w:tc>
@@ -2903,7 +2923,7 @@
                 <w:szCs w:val="18"/>
                 <w:rtl w:val="0"/>
               </w:rPr>
-              <w:t xml:space="preserve">1,58 commits/semana (10 commits en 44 días, del 23/08 al 06/10)</w:t>
+              <w:t>3,45 commits/semana (32 commits en 65 días, del 23/08/2026 al 27/10/2026); con auto-deploy, equivalente a ~3,45 despliegues/semana.</w:t>
             </w:r>
           </w:p>
         </w:tc>
@@ -2924,7 +2944,7 @@
                 <w:szCs w:val="18"/>
                 <w:rtl w:val="0"/>
               </w:rPr>
-              <w:t xml:space="preserve">Se espera que aumente: al bajar el costo y riesgo de integrar (CI valida en segundos), conviene integrar cambios más chicos y seguidos en lugar de lotes grandes espaciados.</w:t>
+              <w:t>Render despliega automáticamente el último commit de main cuando CI pasa; la frecuencia real de despliegues acompaña la de merges a main.</w:t>
             </w:r>
           </w:p>
         </w:tc>
@@ -2972,7 +2992,7 @@
                 <w:szCs w:val="18"/>
                 <w:rtl w:val="0"/>
               </w:rPr>
-              <w:t xml:space="preserve">47 horas</w:t>
+              <w:t>0,2 horas</w:t>
             </w:r>
           </w:p>
         </w:tc>
@@ -2993,7 +3013,7 @@
                 <w:szCs w:val="18"/>
                 <w:rtl w:val="0"/>
               </w:rPr>
-              <w:t xml:space="preserve">El tiempo de validación pasa de indeterminado/manual a 22,7 s de pipeline automatizado (typecheck + 16 tests + build); el lead time restante depende solo de la revisión humana del PR.</w:t>
+              <w:t>El tiempo de validación pasa a 33,1 s de pipeline automatizado (typecheck + 50 tests + build); con autoDeployTrigger: checksPass, Render espera esa validación antes de desplegar.</w:t>
             </w:r>
           </w:p>
         </w:tc>
@@ -3041,7 +3061,7 @@
                 <w:szCs w:val="18"/>
                 <w:rtl w:val="0"/>
               </w:rPr>
-              <w:t xml:space="preserve">450,4 horas (≈18,8 días)</w:t>
+              <w:t>450,4 horas (≈18,8 días)</w:t>
             </w:r>
           </w:p>
         </w:tc>
@@ -3062,7 +3082,7 @@
                 <w:szCs w:val="18"/>
                 <w:rtl w:val="0"/>
               </w:rPr>
-              <w:t xml:space="preserve">Acotado por el quality gate del PR: ningún cambio puede acumularse sin validar más allá de lo que tarda en abrirse y revisarse el Pull Request.</w:t>
+              <w:t>Acotado por el quality gate del PR: ningún cambio puede acumularse sin validar más allá de lo que tarda en abrirse y revisarse el Pull Request.</w:t>
             </w:r>
           </w:p>
         </w:tc>
@@ -3110,7 +3130,7 @@
                 <w:szCs w:val="18"/>
                 <w:rtl w:val="0"/>
               </w:rPr>
-              <w:t xml:space="preserve">0% (0 corridas de CI sobre 10 commits)</w:t>
+              <w:t>0 % (ninguna corrida de CI antes de incorporar el workflow)</w:t>
             </w:r>
           </w:p>
         </w:tc>
@@ -3131,7 +3151,7 @@
                 <w:szCs w:val="18"/>
                 <w:rtl w:val="0"/>
               </w:rPr>
-              <w:t xml:space="preserve">100%: todo push o PR contra main dispara typecheck + 16 tests + build automáticamente (job build-and-test de GitHub Actions).</w:t>
+              <w:t>100 % desde la incorporación: todo push o PR contra main dispara typecheck + 50 tests + build automáticamente (job build-and-test de GitHub Actions); Render despliega el último commit solo si CI pasa.</w:t>
             </w:r>
           </w:p>
         </w:tc>
@@ -3200,7 +3220,7 @@
                 <w:szCs w:val="18"/>
                 <w:rtl w:val="0"/>
               </w:rPr>
-              <w:t xml:space="preserve">Cada commit/PR queda asociado a una corrida de GitHub Actions con resultado (éxito/fallo) y a los artefactos de build publicados.</w:t>
+              <w:t>Cada commit/PR queda asociado a una corrida de GitHub Actions y cada deploy de Render queda asociado al commit desplegado; los artefactos de build se publican.</w:t>
             </w:r>
           </w:p>
         </w:tc>

</xml_diff>